<commit_message>
docs: synchronize current Phase 5 documentation
</commit_message>
<xml_diff>
--- a/LUCY_Project_Detailed_Specification.docx
+++ b/LUCY_Project_Detailed_Specification.docx
@@ -258,7 +258,7 @@
           <w:sz w:val="26"/>
           <w:szCs w:val="26"/>
         </w:rPr>
-        <w:t>Tính năng: Tạo phòng dạy học dựa trên giáo trình (LISA, Chinese, Japanese), ghim tài liệu học tập, quản lý lộ trình học.</w:t>
+        <w:t>Tính năng: Tạo phòng công khai hoặc có mật khẩu, gửi tài liệu học tập, ghi âm và quản lý Podcast, quản lý lộ trình học.</w:t>
       </w:r>
     </w:p>
     <w:p>
@@ -328,7 +328,7 @@
           <w:sz w:val="26"/>
           <w:szCs w:val="26"/>
         </w:rPr>
-        <w:t>Tính năng: Bao gồm quyền Pro + ghi âm buổi Live thành Podcast, tạo chuỗi nội dung thu phí (Premium Content).</w:t>
+        <w:t>Tính năng: Bao gồm quyền Pro + quản lý nội dung Creator, nhận quà và tạo chuỗi nội dung thu phí (Premium Content).</w:t>
       </w:r>
     </w:p>
     <w:p>
@@ -811,7 +811,7 @@
           <w:sz w:val="26"/>
           <w:szCs w:val="26"/>
         </w:rPr>
-        <w:t>Phát triển công cụ LMS cho Pro (Java) và tính năng Record Podcast cho Super (NJS).</w:t>
+        <w:t>Phát triển công cụ LMS cho Pro (Java) và tính năng Record Podcast cho Pro/Super (Node.js/.NET).</w:t>
       </w:r>
     </w:p>
     <w:p>
@@ -1510,7 +1510,7 @@
           <w:sz w:val="26"/>
           <w:szCs w:val="26"/>
         </w:rPr>
-        <w:t xml:space="preserve"> Tính năng lưu trữ Audio (Record) cho tài khoản Super.</w:t>
+        <w:t xml:space="preserve"> Tính năng lưu trữ Audio (Record) cho tài khoản Pro/Super.</w:t>
       </w:r>
     </w:p>
     <w:p>

</xml_diff>